<commit_message>
Add finalized Korean and English manuals
</commit_message>
<xml_diff>
--- a/docs/RFLUASETUP-0.6.33-English-User-Manual.docx
+++ b/docs/RFLUASETUP-0.6.33-English-User-Manual.docx
@@ -109,11 +109,6 @@
       </w:pPr>
       <w:r>
         <w:t>Reference platform: Rotorflight Configurator 2.3.0 and Rotorflight Firmware 4.6.x</w:t>
-      </w:r>
-    </w:p>
-    <w:p>
-      <w:r>
-        <w:br w:type="page"/>
       </w:r>
     </w:p>
     <w:p>
@@ -232,11 +227,6 @@
       </w:pPr>
       <w:r>
         <w:t>Slot-by-slot Rotorflight 2.3 Adjustment reading for reliable telemetry transfer</w:t>
-      </w:r>
-    </w:p>
-    <w:p>
-      <w:r>
-        <w:br w:type="page"/>
       </w:r>
     </w:p>
     <w:p>
@@ -414,7 +404,7 @@
               <w:rPr>
                 <w:b/>
                 <w:color w:val="FFFFFF"/>
-                <w:sz w:val="17"/>
+                <w:sz w:val="16"/>
               </w:rPr>
               <w:t>Status</w:t>
             </w:r>
@@ -431,7 +421,7 @@
               <w:rPr>
                 <w:b/>
                 <w:color w:val="FFFFFF"/>
-                <w:sz w:val="17"/>
+                <w:sz w:val="16"/>
               </w:rPr>
               <w:t>Meaning</w:t>
             </w:r>
@@ -448,7 +438,7 @@
           <w:p>
             <w:r>
               <w:rPr>
-                <w:sz w:val="17"/>
+                <w:sz w:val="16"/>
               </w:rPr>
               <w:t>FC LINK</w:t>
             </w:r>
@@ -463,7 +453,7 @@
           <w:p>
             <w:r>
               <w:rPr>
-                <w:sz w:val="17"/>
+                <w:sz w:val="16"/>
               </w:rPr>
               <w:t>Telemetry MSP communication is available</w:t>
             </w:r>
@@ -480,7 +470,7 @@
           <w:p>
             <w:r>
               <w:rPr>
-                <w:sz w:val="17"/>
+                <w:sz w:val="16"/>
               </w:rPr>
               <w:t>NO LINK</w:t>
             </w:r>
@@ -495,7 +485,7 @@
           <w:p>
             <w:r>
               <w:rPr>
-                <w:sz w:val="17"/>
+                <w:sz w:val="16"/>
               </w:rPr>
               <w:t>Check receiver power, telemetry wiring, model selection, and protocol settings</w:t>
             </w:r>
@@ -512,7 +502,7 @@
           <w:p>
             <w:r>
               <w:rPr>
-                <w:sz w:val="17"/>
+                <w:sz w:val="16"/>
               </w:rPr>
               <w:t>MANUAL</w:t>
             </w:r>
@@ -527,7 +517,7 @@
           <w:p>
             <w:r>
               <w:rPr>
-                <w:sz w:val="17"/>
+                <w:sz w:val="16"/>
               </w:rPr>
               <w:t>Edit locally and save explicitly where supported</w:t>
             </w:r>
@@ -544,7 +534,7 @@
           <w:p>
             <w:r>
               <w:rPr>
-                <w:sz w:val="17"/>
+                <w:sz w:val="16"/>
               </w:rPr>
               <w:t>AUTO</w:t>
             </w:r>
@@ -559,7 +549,7 @@
           <w:p>
             <w:r>
               <w:rPr>
-                <w:sz w:val="17"/>
+                <w:sz w:val="16"/>
               </w:rPr>
               <w:t>Supported changes may be transmitted or saved immediately</w:t>
             </w:r>
@@ -567,12 +557,6 @@
         </w:tc>
       </w:tr>
     </w:tbl>
-    <w:p/>
-    <w:p>
-      <w:r>
-        <w:br w:type="page"/>
-      </w:r>
-    </w:p>
     <w:p>
       <w:pPr>
         <w:pStyle w:val="Heading1"/>
@@ -617,7 +601,7 @@
               <w:rPr>
                 <w:b/>
                 <w:color w:val="FFFFFF"/>
-                <w:sz w:val="17"/>
+                <w:sz w:val="16"/>
               </w:rPr>
               <w:t>Control</w:t>
             </w:r>
@@ -634,7 +618,7 @@
               <w:rPr>
                 <w:b/>
                 <w:color w:val="FFFFFF"/>
-                <w:sz w:val="17"/>
+                <w:sz w:val="16"/>
               </w:rPr>
               <w:t>Action</w:t>
             </w:r>
@@ -651,7 +635,7 @@
           <w:p>
             <w:r>
               <w:rPr>
-                <w:sz w:val="17"/>
+                <w:sz w:val="16"/>
               </w:rPr>
               <w:t>Touch</w:t>
             </w:r>
@@ -666,7 +650,7 @@
           <w:p>
             <w:r>
               <w:rPr>
-                <w:sz w:val="17"/>
+                <w:sz w:val="16"/>
               </w:rPr>
               <w:t>Open buttons, select items, move sliders, or open the numeric keypad</w:t>
             </w:r>
@@ -683,7 +667,7 @@
           <w:p>
             <w:r>
               <w:rPr>
-                <w:sz w:val="17"/>
+                <w:sz w:val="16"/>
               </w:rPr>
               <w:t>Roller</w:t>
             </w:r>
@@ -698,7 +682,7 @@
           <w:p>
             <w:r>
               <w:rPr>
-                <w:sz w:val="17"/>
+                <w:sz w:val="16"/>
               </w:rPr>
               <w:t>Move through menus and fields</w:t>
             </w:r>
@@ -715,7 +699,7 @@
           <w:p>
             <w:r>
               <w:rPr>
-                <w:sz w:val="17"/>
+                <w:sz w:val="16"/>
               </w:rPr>
               <w:t>ENTER</w:t>
             </w:r>
@@ -730,7 +714,7 @@
           <w:p>
             <w:r>
               <w:rPr>
-                <w:sz w:val="17"/>
+                <w:sz w:val="16"/>
               </w:rPr>
               <w:t>Open the selected menu or numeric editor</w:t>
             </w:r>
@@ -747,7 +731,7 @@
           <w:p>
             <w:r>
               <w:rPr>
-                <w:sz w:val="17"/>
+                <w:sz w:val="16"/>
               </w:rPr>
               <w:t>RTN</w:t>
             </w:r>
@@ -762,7 +746,7 @@
           <w:p>
             <w:r>
               <w:rPr>
-                <w:sz w:val="17"/>
+                <w:sz w:val="16"/>
               </w:rPr>
               <w:t>Return to the immediately previous screen</w:t>
             </w:r>
@@ -779,7 +763,7 @@
           <w:p>
             <w:r>
               <w:rPr>
-                <w:sz w:val="17"/>
+                <w:sz w:val="16"/>
               </w:rPr>
               <w:t>Colored scrollbar</w:t>
             </w:r>
@@ -794,7 +778,7 @@
           <w:p>
             <w:r>
               <w:rPr>
-                <w:sz w:val="17"/>
+                <w:sz w:val="16"/>
               </w:rPr>
               <w:t>Shows the current position in long pages</w:t>
             </w:r>
@@ -802,7 +786,6 @@
         </w:tc>
       </w:tr>
     </w:tbl>
-    <w:p/>
     <w:p>
       <w:pPr>
         <w:pStyle w:val="Heading2"/>
@@ -865,11 +848,6 @@
       </w:r>
     </w:p>
     <w:p>
-      <w:r>
-        <w:br w:type="page"/>
-      </w:r>
-    </w:p>
-    <w:p>
       <w:pPr>
         <w:pStyle w:val="Heading1"/>
       </w:pPr>
@@ -908,7 +886,7 @@
               <w:rPr>
                 <w:b/>
                 <w:color w:val="FFFFFF"/>
-                <w:sz w:val="17"/>
+                <w:sz w:val="16"/>
               </w:rPr>
               <w:t>Home item</w:t>
             </w:r>
@@ -925,7 +903,7 @@
               <w:rPr>
                 <w:b/>
                 <w:color w:val="FFFFFF"/>
-                <w:sz w:val="17"/>
+                <w:sz w:val="16"/>
               </w:rPr>
               <w:t>Purpose</w:t>
             </w:r>
@@ -942,7 +920,7 @@
           <w:p>
             <w:r>
               <w:rPr>
-                <w:sz w:val="17"/>
+                <w:sz w:val="16"/>
               </w:rPr>
               <w:t>Full Setup</w:t>
             </w:r>
@@ -957,7 +935,7 @@
           <w:p>
             <w:r>
               <w:rPr>
-                <w:sz w:val="17"/>
+                <w:sz w:val="16"/>
               </w:rPr>
               <w:t>Open the complete four-column configuration menu</w:t>
             </w:r>
@@ -974,7 +952,7 @@
           <w:p>
             <w:r>
               <w:rPr>
-                <w:sz w:val="17"/>
+                <w:sz w:val="16"/>
               </w:rPr>
               <w:t>Easy Setup</w:t>
             </w:r>
@@ -989,7 +967,7 @@
           <w:p>
             <w:r>
               <w:rPr>
-                <w:sz w:val="17"/>
+                <w:sz w:val="16"/>
               </w:rPr>
               <w:t>Coming soon</w:t>
             </w:r>
@@ -1006,7 +984,7 @@
           <w:p>
             <w:r>
               <w:rPr>
-                <w:sz w:val="17"/>
+                <w:sz w:val="16"/>
               </w:rPr>
               <w:t>Profile Fast Link</w:t>
             </w:r>
@@ -1021,7 +999,7 @@
           <w:p>
             <w:r>
               <w:rPr>
-                <w:sz w:val="17"/>
+                <w:sz w:val="16"/>
               </w:rPr>
               <w:t>Open PID Controller Gains for the active profile</w:t>
             </w:r>
@@ -1038,7 +1016,7 @@
           <w:p>
             <w:r>
               <w:rPr>
-                <w:sz w:val="17"/>
+                <w:sz w:val="16"/>
               </w:rPr>
               <w:t>Rates Fast Link</w:t>
             </w:r>
@@ -1053,7 +1031,7 @@
           <w:p>
             <w:r>
               <w:rPr>
-                <w:sz w:val="17"/>
+                <w:sz w:val="16"/>
               </w:rPr>
               <w:t>Open Rate Table for the active rate profile</w:t>
             </w:r>
@@ -1070,7 +1048,7 @@
           <w:p>
             <w:r>
               <w:rPr>
-                <w:sz w:val="17"/>
+                <w:sz w:val="16"/>
               </w:rPr>
               <w:t>Options</w:t>
             </w:r>
@@ -1085,7 +1063,7 @@
           <w:p>
             <w:r>
               <w:rPr>
-                <w:sz w:val="17"/>
+                <w:sz w:val="16"/>
               </w:rPr>
               <w:t>BETA information and save mode; currently under repair</w:t>
             </w:r>
@@ -1102,7 +1080,7 @@
           <w:p>
             <w:r>
               <w:rPr>
-                <w:sz w:val="17"/>
+                <w:sz w:val="16"/>
               </w:rPr>
               <w:t>Exit</w:t>
             </w:r>
@@ -1117,7 +1095,7 @@
           <w:p>
             <w:r>
               <w:rPr>
-                <w:sz w:val="17"/>
+                <w:sz w:val="16"/>
               </w:rPr>
               <w:t>Close the tool</w:t>
             </w:r>
@@ -1125,7 +1103,6 @@
         </w:tc>
       </w:tr>
     </w:tbl>
-    <w:p/>
     <w:p>
       <w:r>
         <w:t>The bottom hardware strip shows detected GYRO, ACCEL, MAG, BARO, GPS, and Dataflash status. Dataflash erase is destructive and must be confirmed.</w:t>
@@ -1162,7 +1139,7 @@
               <w:rPr>
                 <w:b/>
                 <w:color w:val="FFFFFF"/>
-                <w:sz w:val="17"/>
+                <w:sz w:val="16"/>
               </w:rPr>
               <w:t>Full Setup page</w:t>
             </w:r>
@@ -1179,7 +1156,7 @@
               <w:rPr>
                 <w:b/>
                 <w:color w:val="FFFFFF"/>
-                <w:sz w:val="17"/>
+                <w:sz w:val="16"/>
               </w:rPr>
               <w:t>Main purpose</w:t>
             </w:r>
@@ -1196,7 +1173,7 @@
           <w:p>
             <w:r>
               <w:rPr>
-                <w:sz w:val="17"/>
+                <w:sz w:val="16"/>
               </w:rPr>
               <w:t>Status</w:t>
             </w:r>
@@ -1211,7 +1188,7 @@
           <w:p>
             <w:r>
               <w:rPr>
-                <w:sz w:val="17"/>
+                <w:sz w:val="16"/>
               </w:rPr>
               <w:t>Live FC, receiver, attitude, instruments, and arming state</w:t>
             </w:r>
@@ -1228,7 +1205,7 @@
           <w:p>
             <w:r>
               <w:rPr>
-                <w:sz w:val="17"/>
+                <w:sz w:val="16"/>
               </w:rPr>
               <w:t>Setup</w:t>
             </w:r>
@@ -1243,7 +1220,7 @@
           <w:p>
             <w:r>
               <w:rPr>
-                <w:sz w:val="17"/>
+                <w:sz w:val="16"/>
               </w:rPr>
               <w:t>Calibration, reset, save, boot mode, storage mode, and reboot</w:t>
             </w:r>
@@ -1260,7 +1237,7 @@
           <w:p>
             <w:r>
               <w:rPr>
-                <w:sz w:val="17"/>
+                <w:sz w:val="16"/>
               </w:rPr>
               <w:t>Configuration</w:t>
             </w:r>
@@ -1275,7 +1252,7 @@
           <w:p>
             <w:r>
               <w:rPr>
-                <w:sz w:val="17"/>
+                <w:sz w:val="16"/>
               </w:rPr>
               <w:t>Aircraft name, alignment, trim, personalization, statistics, and serial ports</w:t>
             </w:r>
@@ -1292,7 +1269,7 @@
           <w:p>
             <w:r>
               <w:rPr>
-                <w:sz w:val="17"/>
+                <w:sz w:val="16"/>
               </w:rPr>
               <w:t>Receiver</w:t>
             </w:r>
@@ -1307,7 +1284,7 @@
           <w:p>
             <w:r>
               <w:rPr>
-                <w:sz w:val="17"/>
+                <w:sz w:val="16"/>
               </w:rPr>
               <w:t>Protocol, channel ranges, assignment, RSSI, telemetry sensors, and stick preview</w:t>
             </w:r>
@@ -1324,7 +1301,7 @@
           <w:p>
             <w:r>
               <w:rPr>
-                <w:sz w:val="17"/>
+                <w:sz w:val="16"/>
               </w:rPr>
               <w:t>Failsafe</w:t>
             </w:r>
@@ -1339,7 +1316,7 @@
           <w:p>
             <w:r>
               <w:rPr>
-                <w:sz w:val="17"/>
+                <w:sz w:val="16"/>
               </w:rPr>
               <w:t>Signal-loss behavior</w:t>
             </w:r>
@@ -1356,7 +1333,7 @@
           <w:p>
             <w:r>
               <w:rPr>
-                <w:sz w:val="17"/>
+                <w:sz w:val="16"/>
               </w:rPr>
               <w:t>Power</w:t>
             </w:r>
@@ -1371,7 +1348,7 @@
           <w:p>
             <w:r>
               <w:rPr>
-                <w:sz w:val="17"/>
+                <w:sz w:val="16"/>
               </w:rPr>
               <w:t>Battery, voltage, current, and metering</w:t>
             </w:r>
@@ -1388,7 +1365,7 @@
           <w:p>
             <w:r>
               <w:rPr>
-                <w:sz w:val="17"/>
+                <w:sz w:val="16"/>
               </w:rPr>
               <w:t>Motors</w:t>
             </w:r>
@@ -1403,7 +1380,7 @@
           <w:p>
             <w:r>
               <w:rPr>
-                <w:sz w:val="17"/>
+                <w:sz w:val="16"/>
               </w:rPr>
               <w:t>ESC protocol, throttle, ESC telemetry, RPM, gearing, and override</w:t>
             </w:r>
@@ -1420,7 +1397,7 @@
           <w:p>
             <w:r>
               <w:rPr>
-                <w:sz w:val="17"/>
+                <w:sz w:val="16"/>
               </w:rPr>
               <w:t>Governor</w:t>
             </w:r>
@@ -1435,7 +1412,7 @@
           <w:p>
             <w:r>
               <w:rPr>
-                <w:sz w:val="17"/>
+                <w:sz w:val="16"/>
               </w:rPr>
               <w:t>Mode, throttle, ramps, bypass curve, status, and profile values</w:t>
             </w:r>
@@ -1452,7 +1429,7 @@
           <w:p>
             <w:r>
               <w:rPr>
-                <w:sz w:val="17"/>
+                <w:sz w:val="16"/>
               </w:rPr>
               <w:t>Servos</w:t>
             </w:r>
@@ -1467,7 +1444,7 @@
           <w:p>
             <w:r>
               <w:rPr>
-                <w:sz w:val="17"/>
+                <w:sz w:val="16"/>
               </w:rPr>
               <w:t>Center, limits, rate, direction, live output, and override</w:t>
             </w:r>
@@ -1484,7 +1461,7 @@
           <w:p>
             <w:r>
               <w:rPr>
-                <w:sz w:val="17"/>
+                <w:sz w:val="16"/>
               </w:rPr>
               <w:t>Mixer</w:t>
             </w:r>
@@ -1499,7 +1476,7 @@
           <w:p>
             <w:r>
               <w:rPr>
-                <w:sz w:val="17"/>
+                <w:sz w:val="16"/>
               </w:rPr>
               <w:t>Main rotor, direction, trim, geometry, tail, and mixer override</w:t>
             </w:r>
@@ -1516,7 +1493,7 @@
           <w:p>
             <w:r>
               <w:rPr>
-                <w:sz w:val="17"/>
+                <w:sz w:val="16"/>
               </w:rPr>
               <w:t>Gyro</w:t>
             </w:r>
@@ -1531,7 +1508,7 @@
           <w:p>
             <w:r>
               <w:rPr>
-                <w:sz w:val="17"/>
+                <w:sz w:val="16"/>
               </w:rPr>
               <w:t>Filter, notch, RPM filter, and expert settings</w:t>
             </w:r>
@@ -1548,7 +1525,7 @@
           <w:p>
             <w:r>
               <w:rPr>
-                <w:sz w:val="17"/>
+                <w:sz w:val="16"/>
               </w:rPr>
               <w:t>Rates</w:t>
             </w:r>
@@ -1563,7 +1540,7 @@
           <w:p>
             <w:r>
               <w:rPr>
-                <w:sz w:val="17"/>
+                <w:sz w:val="16"/>
               </w:rPr>
               <w:t>Rate type, rate table, curves, dynamics, copy, and reset</w:t>
             </w:r>
@@ -1580,7 +1557,7 @@
           <w:p>
             <w:r>
               <w:rPr>
-                <w:sz w:val="17"/>
+                <w:sz w:val="16"/>
               </w:rPr>
               <w:t>Profiles</w:t>
             </w:r>
@@ -1595,7 +1572,7 @@
           <w:p>
             <w:r>
               <w:rPr>
-                <w:sz w:val="17"/>
+                <w:sz w:val="16"/>
               </w:rPr>
               <w:t>PID gains and aircraft control profile settings</w:t>
             </w:r>
@@ -1612,7 +1589,7 @@
           <w:p>
             <w:r>
               <w:rPr>
-                <w:sz w:val="17"/>
+                <w:sz w:val="16"/>
               </w:rPr>
               <w:t>Modes</w:t>
             </w:r>
@@ -1627,7 +1604,7 @@
           <w:p>
             <w:r>
               <w:rPr>
-                <w:sz w:val="17"/>
+                <w:sz w:val="16"/>
               </w:rPr>
               <w:t>AUX ranges, logic, linked modes, and live markers</w:t>
             </w:r>
@@ -1644,7 +1621,7 @@
           <w:p>
             <w:r>
               <w:rPr>
-                <w:sz w:val="17"/>
+                <w:sz w:val="16"/>
               </w:rPr>
               <w:t>Adjustments</w:t>
             </w:r>
@@ -1659,7 +1636,7 @@
           <w:p>
             <w:r>
               <w:rPr>
-                <w:sz w:val="17"/>
+                <w:sz w:val="16"/>
               </w:rPr>
               <w:t>Mapped and stepped adjustment slots</w:t>
             </w:r>
@@ -1676,7 +1653,7 @@
           <w:p>
             <w:r>
               <w:rPr>
-                <w:sz w:val="17"/>
+                <w:sz w:val="16"/>
               </w:rPr>
               <w:t>Beepers</w:t>
             </w:r>
@@ -1691,7 +1668,7 @@
           <w:p>
             <w:r>
               <w:rPr>
-                <w:sz w:val="17"/>
+                <w:sz w:val="16"/>
               </w:rPr>
               <w:t>Beeper and DSHOT beacon conditions</w:t>
             </w:r>
@@ -1708,7 +1685,7 @@
           <w:p>
             <w:r>
               <w:rPr>
-                <w:sz w:val="17"/>
+                <w:sz w:val="16"/>
               </w:rPr>
               <w:t>Sensors</w:t>
             </w:r>
@@ -1723,7 +1700,7 @@
           <w:p>
             <w:r>
               <w:rPr>
-                <w:sz w:val="17"/>
+                <w:sz w:val="16"/>
               </w:rPr>
               <w:t>Live sensor scopes</w:t>
             </w:r>
@@ -1740,7 +1717,7 @@
           <w:p>
             <w:r>
               <w:rPr>
-                <w:sz w:val="17"/>
+                <w:sz w:val="16"/>
               </w:rPr>
               <w:t>Blackbox</w:t>
             </w:r>
@@ -1755,7 +1732,7 @@
           <w:p>
             <w:r>
               <w:rPr>
-                <w:sz w:val="17"/>
+                <w:sz w:val="16"/>
               </w:rPr>
               <w:t>Logging device, fields, and Dataflash management</w:t>
             </w:r>
@@ -1763,12 +1740,6 @@
         </w:tc>
       </w:tr>
     </w:tbl>
-    <w:p/>
-    <w:p>
-      <w:r>
-        <w:br w:type="page"/>
-      </w:r>
-    </w:p>
     <w:p>
       <w:pPr>
         <w:pStyle w:val="Heading1"/>
@@ -1860,11 +1831,6 @@
       </w:r>
       <w:r>
         <w:t>Changing a UART used by the receiver or telemetry may immediately break the Lua connection. Record the current port assignments and keep USB Configurator recovery available.</w:t>
-      </w:r>
-    </w:p>
-    <w:p>
-      <w:r>
-        <w:br w:type="page"/>
       </w:r>
     </w:p>
     <w:p>
@@ -1966,11 +1932,6 @@
       </w:r>
     </w:p>
     <w:p>
-      <w:r>
-        <w:br w:type="page"/>
-      </w:r>
-    </w:p>
-    <w:p>
       <w:pPr>
         <w:pStyle w:val="Heading1"/>
       </w:pPr>
@@ -2058,11 +2019,6 @@
     <w:p>
       <w:r>
         <w:t>Servo and Mixer pages expose center, limits, rate, direction, swash geometry, tail settings, and overrides. Always start with small override values and watch for mechanical binding.</w:t>
-      </w:r>
-    </w:p>
-    <w:p>
-      <w:r>
-        <w:br w:type="page"/>
       </w:r>
     </w:p>
     <w:p>
@@ -2183,11 +2139,6 @@
       </w:r>
     </w:p>
     <w:p>
-      <w:r>
-        <w:br w:type="page"/>
-      </w:r>
-    </w:p>
-    <w:p>
       <w:pPr>
         <w:pStyle w:val="Heading1"/>
       </w:pPr>
@@ -2252,7 +2203,7 @@
               <w:rPr>
                 <w:b/>
                 <w:color w:val="FFFFFF"/>
-                <w:sz w:val="17"/>
+                <w:sz w:val="16"/>
               </w:rPr>
               <w:t>Type</w:t>
             </w:r>
@@ -2269,7 +2220,7 @@
               <w:rPr>
                 <w:b/>
                 <w:color w:val="FFFFFF"/>
-                <w:sz w:val="17"/>
+                <w:sz w:val="16"/>
               </w:rPr>
               <w:t>Operation</w:t>
             </w:r>
@@ -2286,7 +2237,7 @@
           <w:p>
             <w:r>
               <w:rPr>
-                <w:sz w:val="17"/>
+                <w:sz w:val="16"/>
               </w:rPr>
               <w:t>OFF</w:t>
             </w:r>
@@ -2301,7 +2252,7 @@
           <w:p>
             <w:r>
               <w:rPr>
-                <w:sz w:val="17"/>
+                <w:sz w:val="16"/>
               </w:rPr>
               <w:t>Unused slot</w:t>
             </w:r>
@@ -2318,7 +2269,7 @@
           <w:p>
             <w:r>
               <w:rPr>
-                <w:sz w:val="17"/>
+                <w:sz w:val="16"/>
               </w:rPr>
               <w:t>MAPPED</w:t>
             </w:r>
@@ -2333,7 +2284,7 @@
           <w:p>
             <w:r>
               <w:rPr>
-                <w:sz w:val="17"/>
+                <w:sz w:val="16"/>
               </w:rPr>
               <w:t>Maps the value-channel position continuously between a minimum and maximum value</w:t>
             </w:r>
@@ -2350,7 +2301,7 @@
           <w:p>
             <w:r>
               <w:rPr>
-                <w:sz w:val="17"/>
+                <w:sz w:val="16"/>
               </w:rPr>
               <w:t>STEPPED</w:t>
             </w:r>
@@ -2365,7 +2316,7 @@
           <w:p>
             <w:r>
               <w:rPr>
-                <w:sz w:val="17"/>
+                <w:sz w:val="16"/>
               </w:rPr>
               <w:t>Decreases or increases by the Step amount when the channel enters the assigned ranges</w:t>
             </w:r>
@@ -2373,15 +2324,9 @@
         </w:tc>
       </w:tr>
     </w:tbl>
-    <w:p/>
     <w:p>
       <w:r>
         <w:t>Version 0.6.33 uses the official Rotorflight 2.3 MSP GET ADJUSTMENT RANGE command 156. Each slot is read separately as an exact 14-byte record. This avoids corruption seen when a long all-slot response is transported through telemetry. AUX channels must remain within AUX 1 through AUX 16. Do not save if impossible values such as AUX 132 appear.</w:t>
-      </w:r>
-    </w:p>
-    <w:p>
-      <w:r>
-        <w:br w:type="page"/>
       </w:r>
     </w:p>
     <w:p>
@@ -2432,11 +2377,6 @@
       </w:r>
     </w:p>
     <w:p>
-      <w:r>
-        <w:br w:type="page"/>
-      </w:r>
-    </w:p>
-    <w:p>
       <w:pPr>
         <w:pStyle w:val="Heading1"/>
       </w:pPr>
@@ -2475,7 +2415,7 @@
               <w:rPr>
                 <w:b/>
                 <w:color w:val="FFFFFF"/>
-                <w:sz w:val="17"/>
+                <w:sz w:val="16"/>
               </w:rPr>
               <w:t>Symptom</w:t>
             </w:r>
@@ -2492,7 +2432,7 @@
               <w:rPr>
                 <w:b/>
                 <w:color w:val="FFFFFF"/>
-                <w:sz w:val="17"/>
+                <w:sz w:val="16"/>
               </w:rPr>
               <w:t>Action</w:t>
             </w:r>
@@ -2509,7 +2449,7 @@
           <w:p>
             <w:r>
               <w:rPr>
-                <w:sz w:val="17"/>
+                <w:sz w:val="16"/>
               </w:rPr>
               <w:t>NO LINK</w:t>
             </w:r>
@@ -2524,7 +2464,7 @@
           <w:p>
             <w:r>
               <w:rPr>
-                <w:sz w:val="17"/>
+                <w:sz w:val="16"/>
               </w:rPr>
               <w:t>Check receiver and FC power, telemetry wiring, model selection, and protocol settings.</w:t>
             </w:r>
@@ -2541,7 +2481,7 @@
           <w:p>
             <w:r>
               <w:rPr>
-                <w:sz w:val="17"/>
+                <w:sz w:val="16"/>
               </w:rPr>
               <w:t>Stuck on READING FC</w:t>
             </w:r>
@@ -2556,7 +2496,7 @@
           <w:p>
             <w:r>
               <w:rPr>
-                <w:sz w:val="17"/>
+                <w:sz w:val="16"/>
               </w:rPr>
               <w:t>Close the USB Configurator and restart the Lua tool. Check the telemetry port.</w:t>
             </w:r>
@@ -2573,7 +2513,7 @@
           <w:p>
             <w:r>
               <w:rPr>
-                <w:sz w:val="17"/>
+                <w:sz w:val="16"/>
               </w:rPr>
               <w:t>AUX LIVE READ ERROR</w:t>
             </w:r>
@@ -2588,7 +2528,7 @@
           <w:p>
             <w:r>
               <w:rPr>
-                <w:sz w:val="17"/>
+                <w:sz w:val="16"/>
               </w:rPr>
               <w:t>The MSP RC response is unavailable. Check receiver and telemetry connectivity.</w:t>
             </w:r>
@@ -2605,7 +2545,7 @@
           <w:p>
             <w:r>
               <w:rPr>
-                <w:sz w:val="17"/>
+                <w:sz w:val="16"/>
               </w:rPr>
               <w:t>AUX number above 16</w:t>
             </w:r>
@@ -2620,7 +2560,7 @@
           <w:p>
             <w:r>
               <w:rPr>
-                <w:sz w:val="17"/>
+                <w:sz w:val="16"/>
               </w:rPr>
               <w:t>Do not save. Replace the complete installation with version 0.6.33 or later and read again.</w:t>
             </w:r>
@@ -2637,7 +2577,7 @@
           <w:p>
             <w:r>
               <w:rPr>
-                <w:sz w:val="17"/>
+                <w:sz w:val="16"/>
               </w:rPr>
               <w:t>Script syntax error</w:t>
             </w:r>
@@ -2652,7 +2592,7 @@
           <w:p>
             <w:r>
               <w:rPr>
-                <w:sz w:val="17"/>
+                <w:sz w:val="16"/>
               </w:rPr>
               <w:t>Delete the installed RFLUASETUP folder and copy the complete current folder.</w:t>
             </w:r>
@@ -2669,7 +2609,7 @@
           <w:p>
             <w:r>
               <w:rPr>
-                <w:sz w:val="17"/>
+                <w:sz w:val="16"/>
               </w:rPr>
               <w:t>Change disappears after reboot</w:t>
             </w:r>
@@ -2684,7 +2624,7 @@
           <w:p>
             <w:r>
               <w:rPr>
-                <w:sz w:val="17"/>
+                <w:sz w:val="16"/>
               </w:rPr>
               <w:t>The value was live but not stored. Use SAVE or APPLY AND SAVE.</w:t>
             </w:r>
@@ -2701,7 +2641,7 @@
           <w:p>
             <w:r>
               <w:rPr>
-                <w:sz w:val="17"/>
+                <w:sz w:val="16"/>
               </w:rPr>
               <w:t>Live switch marker does not move</w:t>
             </w:r>
@@ -2716,7 +2656,7 @@
           <w:p>
             <w:r>
               <w:rPr>
-                <w:sz w:val="17"/>
+                <w:sz w:val="16"/>
               </w:rPr>
               <w:t>Check channel assignment, AUX selection, receiver input, and MSP RC polling.</w:t>
             </w:r>
@@ -2733,7 +2673,7 @@
           <w:p>
             <w:r>
               <w:rPr>
-                <w:sz w:val="17"/>
+                <w:sz w:val="16"/>
               </w:rPr>
               <w:t>Link lost after Serial or Telemetry edit</w:t>
             </w:r>
@@ -2748,7 +2688,7 @@
           <w:p>
             <w:r>
               <w:rPr>
-                <w:sz w:val="17"/>
+                <w:sz w:val="16"/>
               </w:rPr>
               <w:t>Reconnect through USB Configurator and restore the previous UART and protocol settings.</w:t>
             </w:r>
@@ -2756,7 +2696,6 @@
         </w:tc>
       </w:tr>
     </w:tbl>
-    <w:p/>
     <w:p>
       <w:pPr>
         <w:pStyle w:val="Heading2"/>
@@ -2811,11 +2750,6 @@
       </w:pPr>
       <w:r>
         <w:t>Photo of the Lua screen and the matching PC Configurator page</w:t>
-      </w:r>
-    </w:p>
-    <w:p>
-      <w:r>
-        <w:br w:type="page"/>
       </w:r>
     </w:p>
     <w:p>
@@ -3371,6 +3305,7 @@
     <w:pPr>
       <w:keepNext/>
       <w:keepLines/>
+      <w:pageBreakBefore/>
       <w:spacing w:before="280" w:after="0"/>
       <w:outlineLvl w:val="0"/>
     </w:pPr>

</xml_diff>